<commit_message>
Restructure deck: add Gap slide, remove Solution, complete Team, export PDF
- Replace inline interactive story with iframe (History artifact + postMessage bridge)
- Add new "The Gap" timeline slide (clearterms_slide_gap.html) with animation
- Remove Solution slide (preserved in Work/Solution Slide.html)
- Update Demo to v2 (Demo artifact v2.html)
- Nav dots reposition to top-right on iframe slides
- Complete Team slide: Gabriela's photo, bullets, and logos (MIT Sloan + BCG)
- Why Baselayer: remove Timing card, 3 cards with bullet format + smart bolding
- Problem slide: add +12% insolvencies stat card
- Data Layer: white font on field name tags
- GTM: remove industry detail parenthetical
- Add Playwright PDF export script (export_pdf.mjs) with per-step captures
- Export 15-page PDF with base64-embedded images
- Update CLAUDE.md with full session context

Co-Authored-By: Claude Opus 4.6 <noreply@anthropic.com>
</commit_message>
<xml_diff>
--- a/Brainstorming/Prompt.docx
+++ b/Brainstorming/Prompt.docx
@@ -887,7 +887,17 @@
     </w:p>
     <w:p/>
     <w:p>
-      <w:r>
+      <w:pPr>
+        <w:rPr>
+          <w:b/>
+          <w:bCs/>
+        </w:rPr>
+      </w:pPr>
+      <w:r>
+        <w:rPr>
+          <w:b/>
+          <w:bCs/>
+        </w:rPr>
         <w:t>Market sizing prompt:</w:t>
       </w:r>
     </w:p>
@@ -947,48 +957,435 @@
         </w:numPr>
       </w:pPr>
       <w:r>
-        <w:t xml:space="preserve">There is a connector, something like </w:t>
+        <w:t>There is a connector, something like a sleek arrow, pointing from that graph to the right side</w:t>
+      </w:r>
+    </w:p>
+    <w:p>
+      <w:pPr>
+        <w:pStyle w:val="ListParagraph"/>
+        <w:numPr>
+          <w:ilvl w:val="0"/>
+          <w:numId w:val="1"/>
+        </w:numPr>
+      </w:pPr>
+      <w:r>
+        <w:t>On the right side, there is a big bubble that represents TAM with those $15 billion. Within it, a smaller bubble says SAM and says $5 billion. A callout explains SAM saying that mid-market segment represents 3</w:t>
+      </w:r>
+      <w:r>
+        <w:t>0</w:t>
+      </w:r>
+      <w:r>
+        <w:t xml:space="preserve">% of </w:t>
+      </w:r>
+      <w:r>
+        <w:t>US businesses revenue (Source: NASDAQ Mid-market Report)</w:t>
+      </w:r>
+    </w:p>
+    <w:p>
+      <w:pPr>
+        <w:pStyle w:val="ListParagraph"/>
+        <w:numPr>
+          <w:ilvl w:val="0"/>
+          <w:numId w:val="1"/>
+        </w:numPr>
+      </w:pPr>
+      <w:r>
+        <w:t>Keep the same citing convention we have been using for sources</w:t>
+      </w:r>
+    </w:p>
+    <w:p/>
+    <w:p>
+      <w:r>
+        <w:t>Make sure the format is consistent with the rest of the deck</w:t>
+      </w:r>
+    </w:p>
+    <w:p/>
+    <w:p>
+      <w:pPr>
+        <w:rPr>
+          <w:b/>
+          <w:bCs/>
+        </w:rPr>
+      </w:pPr>
+      <w:r>
+        <w:rPr>
+          <w:b/>
+          <w:bCs/>
+        </w:rPr>
+        <w:t>GTM prompt</w:t>
+      </w:r>
+      <w:r>
+        <w:rPr>
+          <w:b/>
+          <w:bCs/>
+        </w:rPr>
+        <w:t>:</w:t>
+      </w:r>
+    </w:p>
+    <w:p>
+      <w:r>
+        <w:t xml:space="preserve">Let’s now rework the </w:t>
+      </w:r>
+      <w:r>
+        <w:t xml:space="preserve">go-to-market slide. </w:t>
+      </w:r>
+    </w:p>
+    <w:p/>
+    <w:p>
+      <w:r>
+        <w:t>Title: “We suggest a double go-to-market approach that combines direct sales and partnerships with AR/accounting platforms”</w:t>
+      </w:r>
+    </w:p>
+    <w:p>
+      <w:r>
+        <w:lastRenderedPageBreak/>
+        <w:t>No Subtitle</w:t>
+      </w:r>
+    </w:p>
+    <w:p/>
+    <w:p>
+      <w:r>
+        <w:t xml:space="preserve">Content: </w:t>
+      </w:r>
+    </w:p>
+    <w:p>
+      <w:pPr>
+        <w:pStyle w:val="ListParagraph"/>
+        <w:numPr>
+          <w:ilvl w:val="0"/>
+          <w:numId w:val="1"/>
+        </w:numPr>
+      </w:pPr>
+      <w:r>
+        <w:t>I want to structure it in 3 text columns</w:t>
+      </w:r>
+    </w:p>
+    <w:p>
+      <w:pPr>
+        <w:pStyle w:val="ListParagraph"/>
+        <w:numPr>
+          <w:ilvl w:val="0"/>
+          <w:numId w:val="1"/>
+        </w:numPr>
+      </w:pPr>
+      <w:r>
+        <w:t>The first column is “Target customer”</w:t>
+      </w:r>
+      <w:r>
+        <w:t xml:space="preserve">. Here there are 3 sections (each is one bullet, with the title in black bold and the rest in normal font): </w:t>
+      </w:r>
+    </w:p>
+    <w:p>
+      <w:pPr>
+        <w:pStyle w:val="ListParagraph"/>
+        <w:numPr>
+          <w:ilvl w:val="1"/>
+          <w:numId w:val="1"/>
+        </w:numPr>
+      </w:pPr>
+      <w:r>
+        <w:t>Size: Mid-market B2B sellers ($10-500M revenue)</w:t>
+      </w:r>
+    </w:p>
+    <w:p>
+      <w:pPr>
+        <w:pStyle w:val="ListParagraph"/>
+        <w:numPr>
+          <w:ilvl w:val="1"/>
+          <w:numId w:val="1"/>
+        </w:numPr>
+      </w:pPr>
+      <w:r>
+        <w:t>Industry: Wholesale distribution, Manufacturing, Construction materials (large AR exposure, big average ticket, low margins, long sales cycles)</w:t>
+      </w:r>
+    </w:p>
+    <w:p>
+      <w:pPr>
+        <w:pStyle w:val="ListParagraph"/>
+        <w:numPr>
+          <w:ilvl w:val="1"/>
+          <w:numId w:val="1"/>
+        </w:numPr>
+      </w:pPr>
+      <w:r>
+        <w:t>Buyer persona: CFO (smaller firms) or Credit manager (larger firms)</w:t>
+      </w:r>
+    </w:p>
+    <w:p>
+      <w:pPr>
+        <w:pStyle w:val="ListParagraph"/>
+        <w:numPr>
+          <w:ilvl w:val="0"/>
+          <w:numId w:val="1"/>
+        </w:numPr>
+      </w:pPr>
+      <w:r>
+        <w:t xml:space="preserve">The second column is “Business model”. It has two blocks vertically positioned that take up the entire space of the column, joined with a “plus” sign. Upper block is in darker blue and </w:t>
       </w:r>
       <w:proofErr w:type="gramStart"/>
       <w:r>
-        <w:t>an</w:t>
+        <w:t>says</w:t>
       </w:r>
       <w:proofErr w:type="gramEnd"/>
       <w:r>
-        <w:t xml:space="preserve"> sleek arrow, pointing from that graph to the right side</w:t>
-      </w:r>
-    </w:p>
-    <w:p>
-      <w:pPr>
-        <w:pStyle w:val="ListParagraph"/>
-        <w:numPr>
-          <w:ilvl w:val="0"/>
-          <w:numId w:val="1"/>
-        </w:numPr>
-      </w:pPr>
-      <w:r>
-        <w:t>On the right side, there is a big bubble that represents TAM with those $15 billion. Within it, a smaller bubble says SAM and says $5 billion. A callout explains SAM saying that mid-market segment represents 3</w:t>
-      </w:r>
-      <w:r>
-        <w:t>0</w:t>
-      </w:r>
-      <w:r>
-        <w:t xml:space="preserve">% of </w:t>
-      </w:r>
-      <w:r>
-        <w:t>US businesses revenue (Source: NASDAQ Mid-market Report)</w:t>
-      </w:r>
-    </w:p>
-    <w:p>
-      <w:pPr>
-        <w:pStyle w:val="ListParagraph"/>
-        <w:numPr>
-          <w:ilvl w:val="0"/>
-          <w:numId w:val="1"/>
-        </w:numPr>
-      </w:pPr>
-      <w:r>
-        <w:t>Keep the same citing convention we have been using for sources</w:t>
+        <w:t xml:space="preserve"> “Tiered subscription (with API calls limit)” and the lower block is in lighter color and says “Price-per-volume for additional API calls”</w:t>
+      </w:r>
+    </w:p>
+    <w:p>
+      <w:pPr>
+        <w:pStyle w:val="ListParagraph"/>
+        <w:numPr>
+          <w:ilvl w:val="0"/>
+          <w:numId w:val="1"/>
+        </w:numPr>
+      </w:pPr>
+      <w:r>
+        <w:t xml:space="preserve">The third column is “GTM motion”. It has two bullets indicated by a 1 and a 2, respectively, and the number is circled in a blue circle. 1 is Direct sales, within its area there are two bullets that read “Large accounts (e.g., </w:t>
+      </w:r>
+      <w:proofErr w:type="spellStart"/>
+      <w:r>
+        <w:t>Baselayer</w:t>
+      </w:r>
+      <w:proofErr w:type="spellEnd"/>
+      <w:r>
+        <w:t xml:space="preserve"> Growth/ Enterprise tier)” and “Land POC to validate and iterate product”. 2 is Partnerships, within its area there are again two bullets that </w:t>
+      </w:r>
+      <w:proofErr w:type="gramStart"/>
+      <w:r>
+        <w:t>say</w:t>
+      </w:r>
+      <w:proofErr w:type="gramEnd"/>
+      <w:r>
+        <w:t xml:space="preserve"> “Integrate into AR/accounting platforms (e.g., QuickBooks, Bill.com, </w:t>
+      </w:r>
+      <w:proofErr w:type="spellStart"/>
+      <w:r>
+        <w:t>HighRadius</w:t>
+      </w:r>
+      <w:proofErr w:type="spellEnd"/>
+      <w:r>
+        <w:t>)” and “Enable seamless credit decisioning workflow”</w:t>
+      </w:r>
+    </w:p>
+    <w:p>
+      <w:pPr>
+        <w:pStyle w:val="ListParagraph"/>
+        <w:numPr>
+          <w:ilvl w:val="0"/>
+          <w:numId w:val="1"/>
+        </w:numPr>
+      </w:pPr>
+      <w:r>
+        <w:t>The column titles are in blue</w:t>
+      </w:r>
+    </w:p>
+    <w:p/>
+    <w:p>
+      <w:pPr>
+        <w:rPr>
+          <w:b/>
+          <w:bCs/>
+        </w:rPr>
+      </w:pPr>
+      <w:r>
+        <w:rPr>
+          <w:b/>
+          <w:bCs/>
+        </w:rPr>
+        <w:t>Team prompt:</w:t>
+      </w:r>
+    </w:p>
+    <w:p>
+      <w:r>
+        <w:t>Let’s now build the Team slide.</w:t>
+      </w:r>
+    </w:p>
+    <w:p/>
+    <w:p>
+      <w:r>
+        <w:t>Title: “</w:t>
+      </w:r>
+      <w:r>
+        <w:t>We are the team that can help you achieve this vision”</w:t>
+      </w:r>
+    </w:p>
+    <w:p/>
+    <w:p>
+      <w:r>
+        <w:t>No subtitle</w:t>
+      </w:r>
+    </w:p>
+    <w:p/>
+    <w:p>
+      <w:r>
+        <w:t>Content:</w:t>
+      </w:r>
+    </w:p>
+    <w:p>
+      <w:pPr>
+        <w:pStyle w:val="ListParagraph"/>
+        <w:numPr>
+          <w:ilvl w:val="0"/>
+          <w:numId w:val="1"/>
+        </w:numPr>
+      </w:pPr>
+      <w:r>
+        <w:t>Two team members: Gabriela Aldana and Sergio Sanchez</w:t>
+      </w:r>
+    </w:p>
+    <w:p>
+      <w:pPr>
+        <w:pStyle w:val="ListParagraph"/>
+        <w:numPr>
+          <w:ilvl w:val="0"/>
+          <w:numId w:val="1"/>
+        </w:numPr>
+      </w:pPr>
+      <w:r>
+        <w:t xml:space="preserve">Each has a round picture of their </w:t>
+      </w:r>
+      <w:proofErr w:type="gramStart"/>
+      <w:r>
+        <w:t>face</w:t>
+      </w:r>
+      <w:proofErr w:type="gramEnd"/>
+      <w:r>
+        <w:t xml:space="preserve"> and their name is written in bold right below</w:t>
+      </w:r>
+    </w:p>
+    <w:p>
+      <w:pPr>
+        <w:pStyle w:val="ListParagraph"/>
+        <w:numPr>
+          <w:ilvl w:val="0"/>
+          <w:numId w:val="1"/>
+        </w:numPr>
+      </w:pPr>
+      <w:r>
+        <w:t>Under the names, there are some bullets that explain why each of the two team members are perfectly suited for this</w:t>
+      </w:r>
+    </w:p>
+    <w:p>
+      <w:pPr>
+        <w:pStyle w:val="ListParagraph"/>
+        <w:numPr>
+          <w:ilvl w:val="0"/>
+          <w:numId w:val="1"/>
+        </w:numPr>
+      </w:pPr>
+      <w:r>
+        <w:t>Below the bullet points, some logos with their experience</w:t>
+      </w:r>
+    </w:p>
+    <w:p>
+      <w:pPr>
+        <w:pStyle w:val="ListParagraph"/>
+        <w:numPr>
+          <w:ilvl w:val="0"/>
+          <w:numId w:val="1"/>
+        </w:numPr>
+      </w:pPr>
+      <w:r>
+        <w:t xml:space="preserve">For Sergio Sanchez, you may use the photo in </w:t>
+      </w:r>
+      <w:r>
+        <w:t>@"Inputs/Profile pic_professional.JPEG"</w:t>
+      </w:r>
+      <w:r>
+        <w:t xml:space="preserve"> and these bullet points:</w:t>
+      </w:r>
+    </w:p>
+    <w:p>
+      <w:pPr>
+        <w:pStyle w:val="ListParagraph"/>
+        <w:numPr>
+          <w:ilvl w:val="1"/>
+          <w:numId w:val="1"/>
+        </w:numPr>
+      </w:pPr>
+      <w:r>
+        <w:t>Worked on venture building in credit management space</w:t>
+      </w:r>
+      <w:r>
+        <w:t xml:space="preserve"> </w:t>
+      </w:r>
+      <w:r>
+        <w:t>in late 2025</w:t>
+      </w:r>
+    </w:p>
+    <w:p>
+      <w:pPr>
+        <w:pStyle w:val="ListParagraph"/>
+        <w:numPr>
+          <w:ilvl w:val="1"/>
+          <w:numId w:val="1"/>
+        </w:numPr>
+      </w:pPr>
+      <w:r>
+        <w:t>2+ years in B2B payments startups (</w:t>
+      </w:r>
+      <w:r>
+        <w:t>Growth</w:t>
+      </w:r>
+      <w:r>
+        <w:t xml:space="preserve"> &amp; Strategy)</w:t>
+      </w:r>
+    </w:p>
+    <w:p>
+      <w:pPr>
+        <w:pStyle w:val="ListParagraph"/>
+        <w:numPr>
+          <w:ilvl w:val="1"/>
+          <w:numId w:val="1"/>
+        </w:numPr>
+      </w:pPr>
+      <w:r>
+        <w:t>2+ years in McKinsey (Financial Services and New Venture Building)</w:t>
+      </w:r>
+    </w:p>
+    <w:p>
+      <w:pPr>
+        <w:pStyle w:val="ListParagraph"/>
+        <w:numPr>
+          <w:ilvl w:val="0"/>
+          <w:numId w:val="1"/>
+        </w:numPr>
+      </w:pPr>
+      <w:r>
+        <w:t xml:space="preserve">The logos are three: </w:t>
+      </w:r>
+      <w:r>
+        <w:t>@</w:t>
+      </w:r>
+      <w:proofErr w:type="gramStart"/>
+      <w:r>
+        <w:t>Inputs/MITSloanLogo_MASTER_Print.png ,</w:t>
+      </w:r>
+      <w:proofErr w:type="gramEnd"/>
+      <w:r>
+        <w:t xml:space="preserve"> @Inputs/McKinsey_&amp;_Company-Logo.wine.png and @Inputs/outpayce-logo.png</w:t>
+      </w:r>
+      <w:r>
+        <w:t xml:space="preserve">. </w:t>
+      </w:r>
+      <w:r>
+        <w:lastRenderedPageBreak/>
+        <w:t>Make sure they are evenly distributed, have a similar size (keeping each of their proportions) and take up the entire space of the column</w:t>
+      </w:r>
+    </w:p>
+    <w:p>
+      <w:pPr>
+        <w:pStyle w:val="ListParagraph"/>
+        <w:numPr>
+          <w:ilvl w:val="0"/>
+          <w:numId w:val="1"/>
+        </w:numPr>
+      </w:pPr>
+      <w:r>
+        <w:t>For Gabriela Aldana, leave placeholder for now</w:t>
+      </w:r>
+      <w:r>
+        <w:t xml:space="preserve"> </w:t>
       </w:r>
     </w:p>
     <w:sectPr>
@@ -1019,7 +1416,7 @@
         <w:rFonts w:ascii="Aptos" w:eastAsiaTheme="minorHAnsi" w:hAnsi="Aptos" w:cstheme="minorBidi" w:hint="default"/>
       </w:rPr>
     </w:lvl>
-    <w:lvl w:ilvl="1" w:tplc="04090003" w:tentative="1">
+    <w:lvl w:ilvl="1" w:tplc="04090003">
       <w:start w:val="1"/>
       <w:numFmt w:val="bullet"/>
       <w:lvlText w:val="o"/>

</xml_diff>